<commit_message>
backup: 2026-03-13 05:00 — auto
</commit_message>
<xml_diff>
--- a/juridico/defesa-previa-165a/template_defesa_previa_165a_v2.docx
+++ b/juridico/defesa-previa-165a/template_defesa_previa_165a_v2.docx
@@ -137,6 +137,32 @@
           <w:szCs w:val="20"/>
         </w:rPr>
       </w:pPr>
+    </w:p>
+    <w:p>
+      <w:pPr>
+        <w:autoSpaceDE w:val="0"/>
+        <w:autoSpaceDN w:val="0"/>
+        <w:adjustRightInd w:val="0"/>
+        <w:spacing w:before="120" w:after="120" w:line="360" w:lineRule="auto"/>
+        <w:jc w:val="center"/>
+        <w:rPr>
+          <w:rFonts w:ascii="Segoe UI" w:hAnsi="Segoe UI" w:cs="Segoe UI"/>
+          <w:b/>
+          <w:bCs/>
+          <w:sz w:val="20"/>
+          <w:szCs w:val="20"/>
+        </w:rPr>
+      </w:pPr>
+      <w:r>
+        <w:rPr>
+          <w:rFonts w:ascii="Segoe UI" w:hAnsi="Segoe UI" w:cs="Segoe UI"/>
+          <w:b/>
+          <w:bCs/>
+          <w:sz w:val="20"/>
+          <w:szCs w:val="20"/>
+        </w:rPr>
+        <w:t>DEFESA PRÉVIA E ANEXO</w:t>
+      </w:r>
     </w:p>
     <w:p>
       <w:pPr>

</xml_diff>